<commit_message>
feat: implement premium landing page for Toledo The Bull and deploy to production
</commit_message>
<xml_diff>
--- a/Guia_App_Entrenador_InfiniteCoach.docx
+++ b/Guia_App_Entrenador_InfiniteCoach.docx
@@ -1402,7 +1402,7 @@
           <w:sz w:val="22"/>
           <w:szCs w:val="22"/>
         </w:rPr>
-        <w:t xml:space="preserve">La plataforma implementa un control defensivo de negocio basado en tu nivel de suscripción SaaS. Si estás adscrito al 'Plan Basic', la base de datos limita estrictamente tu cupo a un máximo de 20 clientes activos de forma simultánea. Al intentar activar un alumno, el backend verifica tu consumo de licencias; de superar el límite de 20, la app bloqueará el guardado e invitará al entrenador a actualizar su plan en Configuración.</w:t>
+        <w:t xml:space="preserve">La plataforma implementa un control defensivo de negocio basado en tu nivel de suscripción SaaS. Si estás adscrito al 'Plan Basic', la base de datos limita estrictamente tu cupo a un máximo de 15 clientes activos de forma simultánea. Al intentar activar un alumno, el backend verifica tu consumo de licencias; de superar el límite de 15, la app bloqueará el guardado e invitará al entrenador a actualizar su plan en Configuración.</w:t>
       </w:r>
     </w:p>
     <w:r>
@@ -2771,7 +2771,7 @@
           <w:sz w:val="24"/>
           <w:szCs w:val="24"/>
         </w:rPr>
-        <w:t xml:space="preserve">¿Qué ocurre exactamente cuando alcanzo el límite de 20 clientes en el Plan Basic?</w:t>
+        <w:t xml:space="preserve">¿Qué ocurre exactamente cuando alcanzo el límite de 15 clientes en el Plan Basic?</w:t>
       </w:r>
     </w:p>
     <w:p>

</xml_diff>